<commit_message>
Tighten sleep-disturbance wording after independent review
- Limitation: the relative tests cannot rule out the dosage-sensitivity
  explanation (sleep-annotated genes are more constrained than other genes
  in the dominant and neurodevelopmental sets), so the sleep result is again
  named among the enrichments that may partly reflect it.
- Results: cite the nearest-gene relative tests (one gene per locus), which
  are not inflated by loci carrying several dominant or neurodevelopmental
  genes; "not explained by ... status alone".
- Discussion/README/heading: drop "other" (the dominant or neurodevelopmental
  gene is usually the sleep gene itself); include organ-system sets in the
  broad within-locus excess; heading refers to loci.
- Fig. 2: post hoc q values are "not shown" (they are in Table S3).

Co-Authored-By: Claude Opus 5.5 <noreply@anthropic.com>
Claude-Session: https://claude.ai/code/session_01PWS6UKnuANnJCeVsVNAkng
</commit_message>
<xml_diff>
--- a/manuscript/Malik_Hearn_Towards_chronomic_medicine_2026.docx
+++ b/manuscript/Malik_Hearn_Towards_chronomic_medicine_2026.docx
@@ -2204,13 +2204,13 @@
       </w:r>
     </w:p>
     <w:bookmarkEnd w:id="35"/>
-    <w:bookmarkStart w:id="36" w:name="X3cf24248dc7b47c204b43684ef455c72737e857"/>
+    <w:bookmarkStart w:id="36" w:name="X79f98b96ee7ba8bffd6bfc81367941d799e5cce"/>
     <w:p>
       <w:pPr>
         <w:pStyle w:val="Heading2"/>
       </w:pPr>
       <w:r>
-        <w:t xml:space="preserve">Mendelian sleep-disturbance genes are over-represented, including among dominant and neurodevelopmental disease genes</w:t>
+        <w:t xml:space="preserve">Mendelian sleep-disturbance genes are over-represented, including among loci with dominant or neurodevelopmental disease genes</w:t>
       </w:r>
     </w:p>
     <w:p>
@@ -2274,7 +2274,7 @@
         <w:t xml:space="preserve">−4</w:t>
       </w:r>
       <w:r>
-        <w:t xml:space="preserve">). The excess was not explained by the over-representation of dominant or neurodevelopmental disease genes. Among loci containing an autosomal dominant disease gene, 32.5% contained a sleep-disturbance gene, against 19.2% expected (p = 0.013). Among loci containing a neurodevelopmental disorder gene, 38.4% did so, against 21.7% expected (p = 0.0016). Both relative excesses held in every sensitivity analysis (p ≤ 0.039 and p ≤ 0.017, respectively). Most of the genes involved, however, cause neurodevelopmental disorders (35 of the 39 sleep-disturbance genes at chronotype loci, 24 of them with dominant inheritance). Sleep-disturbance genes without neurodevelopmental features were not enriched, although this set is small (72 genes; 4 vs 3.1 loci; p = 0.38), and neither was the small circadian HPO set (3 vs 1.1; p = 0.098). In MAGMA the sleep-disturbance set was nominally enriched (p = 0.031), including after conditioning on Mendelian genes (p = 0.016), but not after conditioning on neurodevelopmental genes (p = 0.051).</w:t>
+        <w:t xml:space="preserve">). The excess was not explained by dominant inheritance or neurodevelopmental status alone. Among loci containing an autosomal dominant disease gene, 32.5% contained a sleep-disturbance gene, against 19.2% expected (p = 0.013). Among loci containing a neurodevelopmental disorder gene, 38.4% did so, against 21.7% expected (p = 0.0016). Both relative excesses held in every sensitivity analysis (p ≤ 0.039 and p ≤ 0.017, respectively). This included nearest-gene assignment (p = 0.0029 and p = 0.0059), in which each locus contributes a single gene, so the fractions cannot be inflated by loci carrying several dominant or neurodevelopmental disease genes. Most of the genes involved, however, cause neurodevelopmental disorders (35 of the 39 sleep-disturbance genes at chronotype loci, 24 of them with dominant inheritance). Sleep-disturbance genes without neurodevelopmental features were not enriched, although this set is small (72 genes; 4 vs 3.1 loci; p = 0.38), and neither was the small circadian HPO set (3 vs 1.1; p = 0.098). In MAGMA the sleep-disturbance set was nominally enriched (p = 0.031), including after conditioning on Mendelian genes (p = 0.016), but not after conditioning on neurodevelopmental genes (p = 0.051).</w:t>
       </w:r>
     </w:p>
     <w:p>
@@ -3428,16 +3428,331 @@
         <w:pStyle w:val="BodyText"/>
       </w:pPr>
       <w:r>
-        <w:t xml:space="preserve">Convergence between chronotype genetics and Mendelian disease is limited. Apart from a modest and broad excess of dominant and neurodevelopmental disease genes within loci, it is phenotype-specific, as it is for other complex traits</w:t>
+        <w:t xml:space="preserve">Convergence between chronotype genetics and Mendelian disease is limited. Apart from a modest and broad excess of dominant, neurodevelopmental and organ-system disease genes within loci, which has little gene-level support, it is clearest at core clock genes. Common chronotype variants, rare population variants and Mendelian disease variants meet at</w:t>
+      </w:r>
+      <w:r>
+        <w:t xml:space="preserve"> </w:t>
+      </w:r>
+      <w:r>
+        <w:rPr>
+          <w:iCs/>
+          <w:i/>
+        </w:rPr>
+        <w:t xml:space="preserve">PER2</w:t>
+      </w:r>
+      <w:r>
+        <w:t xml:space="preserve">, at</w:t>
+      </w:r>
+      <w:r>
+        <w:t xml:space="preserve"> </w:t>
+      </w:r>
+      <w:r>
+        <w:rPr>
+          <w:iCs/>
+          <w:i/>
+        </w:rPr>
+        <w:t xml:space="preserve">PER3</w:t>
+      </w:r>
+      <w:r>
+        <w:t xml:space="preserve"> </w:t>
+      </w:r>
+      <w:r>
+        <w:t xml:space="preserve">(where the rare-variant evidence depends partly on missense variants up to 1% frequency) and possibly at</w:t>
+      </w:r>
+      <w:r>
+        <w:t xml:space="preserve"> </w:t>
+      </w:r>
+      <w:r>
+        <w:rPr>
+          <w:iCs/>
+          <w:i/>
+        </w:rPr>
+        <w:t xml:space="preserve">FBXL3</w:t>
+      </w:r>
+      <w:r>
+        <w:t xml:space="preserve">. Genes for disorders with disturbed sleep are over-represented at chronotype loci, including among loci containing dominant or neurodevelopmental disease genes, although most of these genes also cause neurodevelopmental disorders and their gene-level support is nominal. Post hoc analyses point to monoamine synthesis and storage and, at</w:t>
+      </w:r>
+      <w:r>
+        <w:t xml:space="preserve"> </w:t>
+      </w:r>
+      <w:r>
+        <w:rPr>
+          <w:iCs/>
+          <w:i/>
+        </w:rPr>
+        <w:t xml:space="preserve">KCNH2</w:t>
+      </w:r>
+      <w:r>
+        <w:t xml:space="preserve">, to a candidate shared variant for chronotype and QT interval. Within the limits of these data,</w:t>
+      </w:r>
+      <w:r>
+        <w:t xml:space="preserve"> </w:t>
+      </w:r>
+      <w:r>
+        <w:rPr>
+          <w:iCs/>
+          <w:i/>
+        </w:rPr>
+        <w:t xml:space="preserve">PER2</w:t>
+      </w:r>
+      <w:r>
+        <w:t xml:space="preserve"> </w:t>
+      </w:r>
+      <w:r>
+        <w:t xml:space="preserve">and</w:t>
+      </w:r>
+      <w:r>
+        <w:t xml:space="preserve"> </w:t>
+      </w:r>
+      <w:r>
+        <w:rPr>
+          <w:iCs/>
+          <w:i/>
+        </w:rPr>
+        <w:t xml:space="preserve">PER3</w:t>
+      </w:r>
+      <w:r>
+        <w:t xml:space="preserve"> </w:t>
+      </w:r>
+      <w:r>
+        <w:t xml:space="preserve">are the clearest current examples of chronomic medicine, and the other links are candidates for replication.</w:t>
+      </w:r>
+    </w:p>
+    <w:p>
+      <w:pPr>
+        <w:pStyle w:val="BodyText"/>
+      </w:pPr>
+      <w:r>
+        <w:t xml:space="preserve">Two methodological points apply beyond chronotype. First, matched null loci are essential. Chronotype loci differ from random genomic regions in gene density, LD and gene content, and enrichment tests against a fixed genome-wide background do not account for this</w:t>
       </w:r>
       <w:r>
         <w:rPr>
           <w:vertAlign w:val="superscript"/>
         </w:rPr>
-        <w:t xml:space="preserve">38</w:t>
-      </w:r>
-      <w:r>
-        <w:t xml:space="preserve">, and it is clearest at core clock genes. Common chronotype variants, rare population variants and Mendelian disease variants meet at</w:t>
+        <w:t xml:space="preserve">42,43</w:t>
+      </w:r>
+      <w:r>
+        <w:t xml:space="preserve">. Second, locus-level and gene-level tests answer different questions and are worth reporting together. A locus-level test counts genes that lie within loci, whereas a gene-level test such as MAGMA asks whether the genes themselves carry more association than other genes. In our data, the circadian control and genes rhythmic in mouse tissues were supported at both levels, whereas gene-level support for the disease-gene sets, including sleep disturbance, was at most nominal.</w:t>
+      </w:r>
+    </w:p>
+    <w:p>
+      <w:pPr>
+        <w:pStyle w:val="BodyText"/>
+      </w:pPr>
+      <w:r>
+        <w:t xml:space="preserve">The sleep-disturbance signal links chronotype loci to the large group of rare neurodevelopmental syndromes in which sleep problems are common and often a major burden for families</w:t>
+      </w:r>
+      <w:r>
+        <w:rPr>
+          <w:vertAlign w:val="superscript"/>
+        </w:rPr>
+        <w:t xml:space="preserve">31</w:t>
+      </w:r>
+      <w:r>
+        <w:t xml:space="preserve">. In some syndromes, such as Smith–Magenis syndrome, the circadian mechanism is established</w:t>
+      </w:r>
+      <w:r>
+        <w:rPr>
+          <w:vertAlign w:val="superscript"/>
+        </w:rPr>
+        <w:t xml:space="preserve">32,33</w:t>
+      </w:r>
+      <w:r>
+        <w:t xml:space="preserve">. The genes for others, including Pitt–Hopkins, Rubinstein–Taybi and Hao–Fountain syndromes, lie at chronotype loci. Our data do not show that these genes are the effector genes at those loci (</w:t>
+      </w:r>
+      <w:r>
+        <w:rPr>
+          <w:iCs/>
+          <w:i/>
+        </w:rPr>
+        <w:t xml:space="preserve">EP300</w:t>
+      </w:r>
+      <w:r>
+        <w:t xml:space="preserve">, for example, has no gene-level support). Nor can they fully separate the sleep phenotype from the neurodevelopmental one. Sleep-disturbance genes were over-represented even among loci containing neurodevelopmental or dominant disease genes, but most of the genes involved cause both, and the gene-level evidence was nominal. Whether sleep problems in these syndromes have a circadian-phase component is nevertheless testable with actigraphy, dim-light melatonin onset or chronotype questionnaires, and the answer would matter for treatment with timed light or melatonin.</w:t>
+      </w:r>
+    </w:p>
+    <w:p>
+      <w:pPr>
+        <w:pStyle w:val="BodyText"/>
+      </w:pPr>
+      <w:r>
+        <w:t xml:space="preserve">The monoamine finding was not anticipated and was defined post hoc, so it needs independent replication. It is biologically coherent:</w:t>
+      </w:r>
+      <w:r>
+        <w:t xml:space="preserve"> </w:t>
+      </w:r>
+      <w:r>
+        <w:rPr>
+          <w:iCs/>
+          <w:i/>
+        </w:rPr>
+        <w:t xml:space="preserve">GCH1</w:t>
+      </w:r>
+      <w:r>
+        <w:t xml:space="preserve">,</w:t>
+      </w:r>
+      <w:r>
+        <w:t xml:space="preserve"> </w:t>
+      </w:r>
+      <w:r>
+        <w:rPr>
+          <w:iCs/>
+          <w:i/>
+        </w:rPr>
+        <w:t xml:space="preserve">DNAJC12</w:t>
+      </w:r>
+      <w:r>
+        <w:t xml:space="preserve">,</w:t>
+      </w:r>
+      <w:r>
+        <w:t xml:space="preserve"> </w:t>
+      </w:r>
+      <w:r>
+        <w:rPr>
+          <w:iCs/>
+          <w:i/>
+        </w:rPr>
+        <w:t xml:space="preserve">DDC</w:t>
+      </w:r>
+      <w:r>
+        <w:t xml:space="preserve"> </w:t>
+      </w:r>
+      <w:r>
+        <w:t xml:space="preserve">and</w:t>
+      </w:r>
+      <w:r>
+        <w:t xml:space="preserve"> </w:t>
+      </w:r>
+      <w:r>
+        <w:rPr>
+          <w:iCs/>
+          <w:i/>
+        </w:rPr>
+        <w:t xml:space="preserve">SLC18A2</w:t>
+      </w:r>
+      <w:r>
+        <w:t xml:space="preserve"> </w:t>
+      </w:r>
+      <w:r>
+        <w:t xml:space="preserve">act at successive steps of serotonin and dopamine synthesis and storage. The evidence is, however, uneven. Only</w:t>
+      </w:r>
+      <w:r>
+        <w:t xml:space="preserve"> </w:t>
+      </w:r>
+      <w:r>
+        <w:rPr>
+          <w:iCs/>
+          <w:i/>
+        </w:rPr>
+        <w:t xml:space="preserve">DDC</w:t>
+      </w:r>
+      <w:r>
+        <w:t xml:space="preserve"> </w:t>
+      </w:r>
+      <w:r>
+        <w:t xml:space="preserve">and</w:t>
+      </w:r>
+      <w:r>
+        <w:t xml:space="preserve"> </w:t>
+      </w:r>
+      <w:r>
+        <w:rPr>
+          <w:iCs/>
+          <w:i/>
+        </w:rPr>
+        <w:t xml:space="preserve">GCH1</w:t>
+      </w:r>
+      <w:r>
+        <w:t xml:space="preserve"> </w:t>
+      </w:r>
+      <w:r>
+        <w:t xml:space="preserve">have gene-level support, the</w:t>
+      </w:r>
+      <w:r>
+        <w:t xml:space="preserve"> </w:t>
+      </w:r>
+      <w:r>
+        <w:rPr>
+          <w:iCs/>
+          <w:i/>
+        </w:rPr>
+        <w:t xml:space="preserve">DNAJC12</w:t>
+      </w:r>
+      <w:r>
+        <w:t xml:space="preserve"> </w:t>
+      </w:r>
+      <w:r>
+        <w:t xml:space="preserve">locus has a strong alternative candidate in the circadian regulator</w:t>
+      </w:r>
+      <w:r>
+        <w:t xml:space="preserve"> </w:t>
+      </w:r>
+      <w:r>
+        <w:rPr>
+          <w:iCs/>
+          <w:i/>
+        </w:rPr>
+        <w:t xml:space="preserve">SIRT1</w:t>
+      </w:r>
+      <w:r>
+        <w:t xml:space="preserve">, and none of the four genes has a rare-variant signal in population exomes. Some of the disorders these genes cause have notable temporal features.</w:t>
+      </w:r>
+      <w:r>
+        <w:t xml:space="preserve"> </w:t>
+      </w:r>
+      <w:r>
+        <w:rPr>
+          <w:iCs/>
+          <w:i/>
+        </w:rPr>
+        <w:t xml:space="preserve">GCH1</w:t>
+      </w:r>
+      <w:r>
+        <w:t xml:space="preserve">-related dopa-responsive dystonia, or Segawa disease, shows marked diurnal fluctuation: symptoms are mild in the morning and worsen through the day, improving after sleep</w:t>
+      </w:r>
+      <w:r>
+        <w:rPr>
+          <w:vertAlign w:val="superscript"/>
+        </w:rPr>
+        <w:t xml:space="preserve">94,95</w:t>
+      </w:r>
+      <w:r>
+        <w:t xml:space="preserve">. Sleep disturbance is common in AADC deficiency</w:t>
+      </w:r>
+      <w:r>
+        <w:rPr>
+          <w:vertAlign w:val="superscript"/>
+        </w:rPr>
+        <w:t xml:space="preserve">96</w:t>
+      </w:r>
+      <w:r>
+        <w:t xml:space="preserve">. These disorders are also treatable. DNAJC12 deficiency and the BH4 deficiencies respond to monoamine precursors or cofactors</w:t>
+      </w:r>
+      <w:r>
+        <w:rPr>
+          <w:vertAlign w:val="superscript"/>
+        </w:rPr>
+        <w:t xml:space="preserve">71,89</w:t>
+      </w:r>
+      <w:r>
+        <w:t xml:space="preserve">, whereas VMAT2 deficiency responds to dopamine agonists and is worsened by levodopa</w:t>
+      </w:r>
+      <w:r>
+        <w:rPr>
+          <w:vertAlign w:val="superscript"/>
+        </w:rPr>
+        <w:t xml:space="preserve">90</w:t>
+      </w:r>
+      <w:r>
+        <w:t xml:space="preserve">. The timing of doses, and of CSF neurotransmitter sampling, are natural targets for chronomic studies in these rare disorders. These are hypotheses that our data motivate but do not test.</w:t>
+      </w:r>
+    </w:p>
+    <w:p>
+      <w:pPr>
+        <w:pStyle w:val="BodyText"/>
+      </w:pPr>
+      <w:r>
+        <w:t xml:space="preserve">The rare-variant results agree with known circadian biology. Rare variants in</w:t>
       </w:r>
       <w:r>
         <w:t xml:space="preserve"> </w:t>
@@ -3450,7 +3765,10 @@
         <w:t xml:space="preserve">PER2</w:t>
       </w:r>
       <w:r>
-        <w:t xml:space="preserve">, at</w:t>
+        <w:t xml:space="preserve"> </w:t>
+      </w:r>
+      <w:r>
+        <w:t xml:space="preserve">and</w:t>
       </w:r>
       <w:r>
         <w:t xml:space="preserve"> </w:t>
@@ -3466,7 +3784,48 @@
         <w:t xml:space="preserve"> </w:t>
       </w:r>
       <w:r>
-        <w:t xml:space="preserve">(where the rare-variant evidence depends partly on missense variants up to 1% frequency) and possibly at</w:t>
+        <w:t xml:space="preserve">were associated with morningness, matching the advanced sleep phase of the corresponding Mendelian disorders</w:t>
+      </w:r>
+      <w:r>
+        <w:rPr>
+          <w:vertAlign w:val="superscript"/>
+        </w:rPr>
+        <w:t xml:space="preserve">20,22</w:t>
+      </w:r>
+      <w:r>
+        <w:t xml:space="preserve">. The</w:t>
+      </w:r>
+      <w:r>
+        <w:t xml:space="preserve"> </w:t>
+      </w:r>
+      <w:r>
+        <w:rPr>
+          <w:iCs/>
+          <w:i/>
+        </w:rPr>
+        <w:t xml:space="preserve">PER2</w:t>
+      </w:r>
+      <w:r>
+        <w:t xml:space="preserve"> </w:t>
+      </w:r>
+      <w:r>
+        <w:t xml:space="preserve">signal came from the rarest pLOF variants. The</w:t>
+      </w:r>
+      <w:r>
+        <w:t xml:space="preserve"> </w:t>
+      </w:r>
+      <w:r>
+        <w:rPr>
+          <w:iCs/>
+          <w:i/>
+        </w:rPr>
+        <w:t xml:space="preserve">PER3</w:t>
+      </w:r>
+      <w:r>
+        <w:t xml:space="preserve"> </w:t>
+      </w:r>
+      <w:r>
+        <w:t xml:space="preserve">signal was strongest when missense variants up to 1% frequency were included, so part of it may reflect less rare variants, and it cannot be attributed to loss of function alone. Deleterious</w:t>
       </w:r>
       <w:r>
         <w:t xml:space="preserve"> </w:t>
@@ -3479,7 +3838,81 @@
         <w:t xml:space="preserve">FBXL3</w:t>
       </w:r>
       <w:r>
-        <w:t xml:space="preserve">. Genes for disorders with disturbed sleep are over-represented at chronotype loci, including among loci containing other dominant and neurodevelopmental disease genes, although most of these genes also cause neurodevelopmental disorders and their gene-level support is nominal. Post hoc analyses point to monoamine synthesis and storage and, at</w:t>
+        <w:t xml:space="preserve"> </w:t>
+      </w:r>
+      <w:r>
+        <w:t xml:space="preserve">variants were nominally associated with eveningness, matching the long period of</w:t>
+      </w:r>
+      <w:r>
+        <w:t xml:space="preserve"> </w:t>
+      </w:r>
+      <w:r>
+        <w:rPr>
+          <w:iCs/>
+          <w:i/>
+        </w:rPr>
+        <w:t xml:space="preserve">Fbxl3</w:t>
+      </w:r>
+      <w:r>
+        <w:t xml:space="preserve"> </w:t>
+      </w:r>
+      <w:r>
+        <w:t xml:space="preserve">mutant mice</w:t>
+      </w:r>
+      <w:r>
+        <w:rPr>
+          <w:vertAlign w:val="superscript"/>
+        </w:rPr>
+        <w:t xml:space="preserve">92,93</w:t>
+      </w:r>
+      <w:r>
+        <w:t xml:space="preserve">. These population effects are much smaller than in families, consistent with the modest penetrance of reported Mendelian sleep variants</w:t>
+      </w:r>
+      <w:r>
+        <w:rPr>
+          <w:vertAlign w:val="superscript"/>
+        </w:rPr>
+        <w:t xml:space="preserve">34</w:t>
+      </w:r>
+      <w:r>
+        <w:t xml:space="preserve">. The excess burden signal among Mendelian genes at chronotype loci was attributable to these clock genes, and we found little evidence of more widespread rare-variant convergence. The</w:t>
+      </w:r>
+      <w:r>
+        <w:t xml:space="preserve"> </w:t>
+      </w:r>
+      <w:r>
+        <w:rPr>
+          <w:iCs/>
+          <w:i/>
+        </w:rPr>
+        <w:t xml:space="preserve">MTNR1B</w:t>
+      </w:r>
+      <w:r>
+        <w:t xml:space="preserve"> </w:t>
+      </w:r>
+      <w:r>
+        <w:t xml:space="preserve">association with morningness depended on the masks up to 1% frequency, and the gene lies outside the chronotype loci. It may therefore partly reflect common variation near</w:t>
+      </w:r>
+      <w:r>
+        <w:t xml:space="preserve"> </w:t>
+      </w:r>
+      <w:r>
+        <w:rPr>
+          <w:iCs/>
+          <w:i/>
+        </w:rPr>
+        <w:t xml:space="preserve">MTNR1B</w:t>
+      </w:r>
+      <w:r>
+        <w:t xml:space="preserve">, which also has a common-variant gene-level signal.</w:t>
+      </w:r>
+    </w:p>
+    <w:p>
+      <w:pPr>
+        <w:pStyle w:val="BodyText"/>
+      </w:pPr>
+      <w:r>
+        <w:t xml:space="preserve">At</w:t>
       </w:r>
       <w:r>
         <w:t xml:space="preserve"> </w:t>
@@ -3492,39 +3925,66 @@
         <w:t xml:space="preserve">KCNH2</w:t>
       </w:r>
       <w:r>
-        <w:t xml:space="preserve">, to a candidate shared variant for chronotype and QT interval. Within the limits of these data,</w:t>
-      </w:r>
-      <w:r>
-        <w:t xml:space="preserve"> </w:t>
-      </w:r>
-      <w:r>
-        <w:rPr>
-          <w:iCs/>
-          <w:i/>
-        </w:rPr>
-        <w:t xml:space="preserve">PER2</w:t>
-      </w:r>
-      <w:r>
-        <w:t xml:space="preserve"> </w:t>
-      </w:r>
-      <w:r>
-        <w:t xml:space="preserve">and</w:t>
-      </w:r>
-      <w:r>
-        <w:t xml:space="preserve"> </w:t>
-      </w:r>
-      <w:r>
-        <w:rPr>
-          <w:iCs/>
-          <w:i/>
-        </w:rPr>
-        <w:t xml:space="preserve">PER3</w:t>
-      </w:r>
-      <w:r>
-        <w:t xml:space="preserve"> </w:t>
-      </w:r>
-      <w:r>
-        <w:t xml:space="preserve">are the clearest current examples of chronomic medicine, and the other links are candidates for replication.</w:t>
+        <w:t xml:space="preserve">, our data suggest that a chronotype signal and a secondary QT-interval signal may share a causal variant, at which the allele associated with morningness would lengthen the QT interval. Cardiac repolarisation is under circadian control: the cardiomyocyte clock regulates</w:t>
+      </w:r>
+      <w:r>
+        <w:t xml:space="preserve"> </w:t>
+      </w:r>
+      <w:r>
+        <w:rPr>
+          <w:iCs/>
+          <w:i/>
+        </w:rPr>
+        <w:t xml:space="preserve">Kcnh2</w:t>
+      </w:r>
+      <w:r>
+        <w:t xml:space="preserve"> </w:t>
+      </w:r>
+      <w:r>
+        <w:t xml:space="preserve">expression and ventricular repolarisation</w:t>
+      </w:r>
+      <w:r>
+        <w:rPr>
+          <w:vertAlign w:val="superscript"/>
+        </w:rPr>
+        <w:t xml:space="preserve">48–50</w:t>
+      </w:r>
+      <w:r>
+        <w:t xml:space="preserve">, and cardiac events in long QT syndrome cluster by time of day in a genotype-dependent way</w:t>
+      </w:r>
+      <w:r>
+        <w:rPr>
+          <w:vertAlign w:val="superscript"/>
+        </w:rPr>
+        <w:t xml:space="preserve">97,98</w:t>
+      </w:r>
+      <w:r>
+        <w:t xml:space="preserve">. A variant that influences both circadian preference and the QT interval would therefore be of interest for chronomic medicine. The evidence is, however, limited. The conditional analysis was post hoc, and the chronotype association at this locus is not genome-wide significant in the UK Biobank data. The joint conditional model showed signs of mismatch between the 503-sample European reference panel and the multi-ancestry QT meta-analysis. The gene through which the variant acts is unknown:</w:t>
+      </w:r>
+      <w:r>
+        <w:t xml:space="preserve"> </w:t>
+      </w:r>
+      <w:r>
+        <w:rPr>
+          <w:iCs/>
+          <w:i/>
+        </w:rPr>
+        <w:t xml:space="preserve">KCNH2</w:t>
+      </w:r>
+      <w:r>
+        <w:t xml:space="preserve"> </w:t>
+      </w:r>
+      <w:r>
+        <w:t xml:space="preserve">has little other gene-level support for chronotype and is also expressed in the brain. The finding should be tested with in-sample LD (for example, conditional or SuSiE-based colocalisation in UK Biobank) and an independent chronotype GWAS. Complement and immune phenotypes, by contrast, were not enriched, despite strong evidence for circadian control of immunity</w:t>
+      </w:r>
+      <w:r>
+        <w:rPr>
+          <w:vertAlign w:val="superscript"/>
+        </w:rPr>
+        <w:t xml:space="preserve">51</w:t>
+      </w:r>
+      <w:r>
+        <w:t xml:space="preserve">.</w:t>
       </w:r>
     </w:p>
     <w:p>
@@ -3532,565 +3992,96 @@
         <w:pStyle w:val="BodyText"/>
       </w:pPr>
       <w:r>
-        <w:t xml:space="preserve">Two methodological points apply beyond chronotype. First, matched null loci are essential. Chronotype loci differ from random genomic regions in gene density, LD and gene content, and enrichment tests against a fixed genome-wide background do not account for this</w:t>
+        <w:t xml:space="preserve">One practical observation concerns phenotype ontologies. HPO includes modifiers for temporal patterns, such as</w:t>
+      </w:r>
+      <w:r>
+        <w:t xml:space="preserve"> </w:t>
+      </w:r>
+      <w:r>
+        <w:t xml:space="preserve">“</w:t>
+      </w:r>
+      <w:r>
+        <w:t xml:space="preserve">Diurnal</w:t>
+      </w:r>
+      <w:r>
+        <w:t xml:space="preserve">”</w:t>
+      </w:r>
+      <w:r>
+        <w:t xml:space="preserve"> </w:t>
+      </w:r>
+      <w:r>
+        <w:t xml:space="preserve">(HP:0025302),</w:t>
+      </w:r>
+      <w:r>
+        <w:t xml:space="preserve"> </w:t>
+      </w:r>
+      <w:r>
+        <w:t xml:space="preserve">“</w:t>
+      </w:r>
+      <w:r>
+        <w:t xml:space="preserve">Fluctuating</w:t>
+      </w:r>
+      <w:r>
+        <w:t xml:space="preserve">”</w:t>
+      </w:r>
+      <w:r>
+        <w:t xml:space="preserve"> </w:t>
+      </w:r>
+      <w:r>
+        <w:t xml:space="preserve">(HP:0031914),</w:t>
+      </w:r>
+      <w:r>
+        <w:t xml:space="preserve"> </w:t>
+      </w:r>
+      <w:r>
+        <w:t xml:space="preserve">“</w:t>
+      </w:r>
+      <w:r>
+        <w:t xml:space="preserve">Nocturnal</w:t>
+      </w:r>
+      <w:r>
+        <w:t xml:space="preserve">”</w:t>
+      </w:r>
+      <w:r>
+        <w:t xml:space="preserve"> </w:t>
+      </w:r>
+      <w:r>
+        <w:t xml:space="preserve">(HP:0025301) and</w:t>
+      </w:r>
+      <w:r>
+        <w:t xml:space="preserve"> </w:t>
+      </w:r>
+      <w:r>
+        <w:t xml:space="preserve">“</w:t>
+      </w:r>
+      <w:r>
+        <w:t xml:space="preserve">Worse in evening</w:t>
+      </w:r>
+      <w:r>
+        <w:t xml:space="preserve">”</w:t>
+      </w:r>
+      <w:r>
+        <w:t xml:space="preserve"> </w:t>
+      </w:r>
+      <w:r>
+        <w:t xml:space="preserve">(HP:0410401). In the release we used, the diurnal, fluctuating and worse-in-evening modifiers together accounted for 0 of the 286,651 disease–phenotype annotations, and the nocturnal modifier for 1. The 134 annotations with any temporal-pattern modifier mostly described recurrence or chronicity. Dopa-responsive dystonia, a textbook example of a disease with diurnal fluctuation, is not annotated as such. Apart from a few phenotype terms that build in timing, such as nocturnal seizures, time-of-day features of rare diseases are therefore largely absent from the annotations that computational analyses such as ours depend on. Systematic chronomic phenotyping, meaning annotation of when symptoms, events and biomarker abnormalities occur, would be a straightforward step towards chronomic medicine.</w:t>
+      </w:r>
+    </w:p>
+    <w:p>
+      <w:pPr>
+        <w:pStyle w:val="BodyText"/>
+      </w:pPr>
+      <w:r>
+        <w:t xml:space="preserve">This study has limitations. All chronotype data were from individuals of European ancestry, and chronotype was self-reported. The MAGMA, burden and colocalisation analyses used UK Biobank data alone, because the 23andMe statistics are not public, and the LD reference contained only 503 individuals. Gene-to-disease and phenotype annotations are incomplete and biased towards well-studied syndromes. Matching on gene count approximates, but does not eliminate, differences between chronotype and null loci. GWAS signals tend to lie near LoF-constrained, dosage-sensitive genes, which are over-represented among genes for dominant and neurodevelopmental disorders</w:t>
       </w:r>
       <w:r>
         <w:rPr>
           <w:vertAlign w:val="superscript"/>
         </w:rPr>
-        <w:t xml:space="preserve">42,43</w:t>
-      </w:r>
-      <w:r>
-        <w:t xml:space="preserve">. Second, locus-level and gene-level tests answer different questions and are worth reporting together. A locus-level test counts genes that lie within loci, whereas a gene-level test such as MAGMA asks whether the genes themselves carry more association than other genes. In our data, the circadian control and genes rhythmic in mouse tissues were supported at both levels, whereas gene-level support for the disease-gene sets, including sleep disturbance, was at most nominal.</w:t>
-      </w:r>
-    </w:p>
-    <w:p>
-      <w:pPr>
-        <w:pStyle w:val="BodyText"/>
-      </w:pPr>
-      <w:r>
-        <w:t xml:space="preserve">The sleep-disturbance signal links chronotype loci to the large group of rare neurodevelopmental syndromes in which sleep problems are common and often a major burden for families</w:t>
-      </w:r>
-      <w:r>
-        <w:rPr>
-          <w:vertAlign w:val="superscript"/>
-        </w:rPr>
-        <w:t xml:space="preserve">31</w:t>
-      </w:r>
-      <w:r>
-        <w:t xml:space="preserve">. In some syndromes, such as Smith–Magenis syndrome, the circadian mechanism is established</w:t>
-      </w:r>
-      <w:r>
-        <w:rPr>
-          <w:vertAlign w:val="superscript"/>
-        </w:rPr>
-        <w:t xml:space="preserve">32,33</w:t>
-      </w:r>
-      <w:r>
-        <w:t xml:space="preserve">. The genes for others, including Pitt–Hopkins, Rubinstein–Taybi and Hao–Fountain syndromes, lie at chronotype loci. Our data do not show that these genes are the effector genes at those loci (</w:t>
-      </w:r>
-      <w:r>
-        <w:rPr>
-          <w:iCs/>
-          <w:i/>
-        </w:rPr>
-        <w:t xml:space="preserve">EP300</w:t>
-      </w:r>
-      <w:r>
-        <w:t xml:space="preserve">, for example, has no gene-level support). Nor can they fully separate the sleep phenotype from the neurodevelopmental one. Sleep-disturbance genes were over-represented even among loci containing neurodevelopmental or dominant disease genes, but most of the genes involved cause both, and the gene-level evidence was nominal. Whether sleep problems in these syndromes have a circadian-phase component is nevertheless testable with actigraphy, dim-light melatonin onset or chronotype questionnaires, and the answer would matter for treatment with timed light or melatonin.</w:t>
-      </w:r>
-    </w:p>
-    <w:p>
-      <w:pPr>
-        <w:pStyle w:val="BodyText"/>
-      </w:pPr>
-      <w:r>
-        <w:t xml:space="preserve">The monoamine finding was not anticipated and was defined post hoc, so it needs independent replication. It is biologically coherent:</w:t>
-      </w:r>
-      <w:r>
-        <w:t xml:space="preserve"> </w:t>
-      </w:r>
-      <w:r>
-        <w:rPr>
-          <w:iCs/>
-          <w:i/>
-        </w:rPr>
-        <w:t xml:space="preserve">GCH1</w:t>
-      </w:r>
-      <w:r>
-        <w:t xml:space="preserve">,</w:t>
-      </w:r>
-      <w:r>
-        <w:t xml:space="preserve"> </w:t>
-      </w:r>
-      <w:r>
-        <w:rPr>
-          <w:iCs/>
-          <w:i/>
-        </w:rPr>
-        <w:t xml:space="preserve">DNAJC12</w:t>
-      </w:r>
-      <w:r>
-        <w:t xml:space="preserve">,</w:t>
-      </w:r>
-      <w:r>
-        <w:t xml:space="preserve"> </w:t>
-      </w:r>
-      <w:r>
-        <w:rPr>
-          <w:iCs/>
-          <w:i/>
-        </w:rPr>
-        <w:t xml:space="preserve">DDC</w:t>
-      </w:r>
-      <w:r>
-        <w:t xml:space="preserve"> </w:t>
-      </w:r>
-      <w:r>
-        <w:t xml:space="preserve">and</w:t>
-      </w:r>
-      <w:r>
-        <w:t xml:space="preserve"> </w:t>
-      </w:r>
-      <w:r>
-        <w:rPr>
-          <w:iCs/>
-          <w:i/>
-        </w:rPr>
-        <w:t xml:space="preserve">SLC18A2</w:t>
-      </w:r>
-      <w:r>
-        <w:t xml:space="preserve"> </w:t>
-      </w:r>
-      <w:r>
-        <w:t xml:space="preserve">act at successive steps of serotonin and dopamine synthesis and storage. The evidence is, however, uneven. Only</w:t>
-      </w:r>
-      <w:r>
-        <w:t xml:space="preserve"> </w:t>
-      </w:r>
-      <w:r>
-        <w:rPr>
-          <w:iCs/>
-          <w:i/>
-        </w:rPr>
-        <w:t xml:space="preserve">DDC</w:t>
-      </w:r>
-      <w:r>
-        <w:t xml:space="preserve"> </w:t>
-      </w:r>
-      <w:r>
-        <w:t xml:space="preserve">and</w:t>
-      </w:r>
-      <w:r>
-        <w:t xml:space="preserve"> </w:t>
-      </w:r>
-      <w:r>
-        <w:rPr>
-          <w:iCs/>
-          <w:i/>
-        </w:rPr>
-        <w:t xml:space="preserve">GCH1</w:t>
-      </w:r>
-      <w:r>
-        <w:t xml:space="preserve"> </w:t>
-      </w:r>
-      <w:r>
-        <w:t xml:space="preserve">have gene-level support, the</w:t>
-      </w:r>
-      <w:r>
-        <w:t xml:space="preserve"> </w:t>
-      </w:r>
-      <w:r>
-        <w:rPr>
-          <w:iCs/>
-          <w:i/>
-        </w:rPr>
-        <w:t xml:space="preserve">DNAJC12</w:t>
-      </w:r>
-      <w:r>
-        <w:t xml:space="preserve"> </w:t>
-      </w:r>
-      <w:r>
-        <w:t xml:space="preserve">locus has a strong alternative candidate in the circadian regulator</w:t>
-      </w:r>
-      <w:r>
-        <w:t xml:space="preserve"> </w:t>
-      </w:r>
-      <w:r>
-        <w:rPr>
-          <w:iCs/>
-          <w:i/>
-        </w:rPr>
-        <w:t xml:space="preserve">SIRT1</w:t>
-      </w:r>
-      <w:r>
-        <w:t xml:space="preserve">, and none of the four genes has a rare-variant signal in population exomes. Some of the disorders these genes cause have notable temporal features.</w:t>
-      </w:r>
-      <w:r>
-        <w:t xml:space="preserve"> </w:t>
-      </w:r>
-      <w:r>
-        <w:rPr>
-          <w:iCs/>
-          <w:i/>
-        </w:rPr>
-        <w:t xml:space="preserve">GCH1</w:t>
-      </w:r>
-      <w:r>
-        <w:t xml:space="preserve">-related dopa-responsive dystonia, or Segawa disease, shows marked diurnal fluctuation: symptoms are mild in the morning and worsen through the day, improving after sleep</w:t>
-      </w:r>
-      <w:r>
-        <w:rPr>
-          <w:vertAlign w:val="superscript"/>
-        </w:rPr>
-        <w:t xml:space="preserve">94,95</w:t>
-      </w:r>
-      <w:r>
-        <w:t xml:space="preserve">. Sleep disturbance is common in AADC deficiency</w:t>
-      </w:r>
-      <w:r>
-        <w:rPr>
-          <w:vertAlign w:val="superscript"/>
-        </w:rPr>
-        <w:t xml:space="preserve">96</w:t>
-      </w:r>
-      <w:r>
-        <w:t xml:space="preserve">. These disorders are also treatable. DNAJC12 deficiency and the BH4 deficiencies respond to monoamine precursors or cofactors</w:t>
-      </w:r>
-      <w:r>
-        <w:rPr>
-          <w:vertAlign w:val="superscript"/>
-        </w:rPr>
-        <w:t xml:space="preserve">71,89</w:t>
-      </w:r>
-      <w:r>
-        <w:t xml:space="preserve">, whereas VMAT2 deficiency responds to dopamine agonists and is worsened by levodopa</w:t>
-      </w:r>
-      <w:r>
-        <w:rPr>
-          <w:vertAlign w:val="superscript"/>
-        </w:rPr>
-        <w:t xml:space="preserve">90</w:t>
-      </w:r>
-      <w:r>
-        <w:t xml:space="preserve">. The timing of doses, and of CSF neurotransmitter sampling, are natural targets for chronomic studies in these rare disorders. These are hypotheses that our data motivate but do not test.</w:t>
-      </w:r>
-    </w:p>
-    <w:p>
-      <w:pPr>
-        <w:pStyle w:val="BodyText"/>
-      </w:pPr>
-      <w:r>
-        <w:t xml:space="preserve">The rare-variant results agree with known circadian biology. Rare variants in</w:t>
-      </w:r>
-      <w:r>
-        <w:t xml:space="preserve"> </w:t>
-      </w:r>
-      <w:r>
-        <w:rPr>
-          <w:iCs/>
-          <w:i/>
-        </w:rPr>
-        <w:t xml:space="preserve">PER2</w:t>
-      </w:r>
-      <w:r>
-        <w:t xml:space="preserve"> </w:t>
-      </w:r>
-      <w:r>
-        <w:t xml:space="preserve">and</w:t>
-      </w:r>
-      <w:r>
-        <w:t xml:space="preserve"> </w:t>
-      </w:r>
-      <w:r>
-        <w:rPr>
-          <w:iCs/>
-          <w:i/>
-        </w:rPr>
-        <w:t xml:space="preserve">PER3</w:t>
-      </w:r>
-      <w:r>
-        <w:t xml:space="preserve"> </w:t>
-      </w:r>
-      <w:r>
-        <w:t xml:space="preserve">were associated with morningness, matching the advanced sleep phase of the corresponding Mendelian disorders</w:t>
-      </w:r>
-      <w:r>
-        <w:rPr>
-          <w:vertAlign w:val="superscript"/>
-        </w:rPr>
-        <w:t xml:space="preserve">20,22</w:t>
-      </w:r>
-      <w:r>
-        <w:t xml:space="preserve">. The</w:t>
-      </w:r>
-      <w:r>
-        <w:t xml:space="preserve"> </w:t>
-      </w:r>
-      <w:r>
-        <w:rPr>
-          <w:iCs/>
-          <w:i/>
-        </w:rPr>
-        <w:t xml:space="preserve">PER2</w:t>
-      </w:r>
-      <w:r>
-        <w:t xml:space="preserve"> </w:t>
-      </w:r>
-      <w:r>
-        <w:t xml:space="preserve">signal came from the rarest pLOF variants. The</w:t>
-      </w:r>
-      <w:r>
-        <w:t xml:space="preserve"> </w:t>
-      </w:r>
-      <w:r>
-        <w:rPr>
-          <w:iCs/>
-          <w:i/>
-        </w:rPr>
-        <w:t xml:space="preserve">PER3</w:t>
-      </w:r>
-      <w:r>
-        <w:t xml:space="preserve"> </w:t>
-      </w:r>
-      <w:r>
-        <w:t xml:space="preserve">signal was strongest when missense variants up to 1% frequency were included, so part of it may reflect less rare variants, and it cannot be attributed to loss of function alone. Deleterious</w:t>
-      </w:r>
-      <w:r>
-        <w:t xml:space="preserve"> </w:t>
-      </w:r>
-      <w:r>
-        <w:rPr>
-          <w:iCs/>
-          <w:i/>
-        </w:rPr>
-        <w:t xml:space="preserve">FBXL3</w:t>
-      </w:r>
-      <w:r>
-        <w:t xml:space="preserve"> </w:t>
-      </w:r>
-      <w:r>
-        <w:t xml:space="preserve">variants were nominally associated with eveningness, matching the long period of</w:t>
-      </w:r>
-      <w:r>
-        <w:t xml:space="preserve"> </w:t>
-      </w:r>
-      <w:r>
-        <w:rPr>
-          <w:iCs/>
-          <w:i/>
-        </w:rPr>
-        <w:t xml:space="preserve">Fbxl3</w:t>
-      </w:r>
-      <w:r>
-        <w:t xml:space="preserve"> </w:t>
-      </w:r>
-      <w:r>
-        <w:t xml:space="preserve">mutant mice</w:t>
-      </w:r>
-      <w:r>
-        <w:rPr>
-          <w:vertAlign w:val="superscript"/>
-        </w:rPr>
-        <w:t xml:space="preserve">92,93</w:t>
-      </w:r>
-      <w:r>
-        <w:t xml:space="preserve">. These population effects are much smaller than in families, consistent with the modest penetrance of reported Mendelian sleep variants</w:t>
-      </w:r>
-      <w:r>
-        <w:rPr>
-          <w:vertAlign w:val="superscript"/>
-        </w:rPr>
-        <w:t xml:space="preserve">34</w:t>
-      </w:r>
-      <w:r>
-        <w:t xml:space="preserve">. The excess burden signal among Mendelian genes at chronotype loci was attributable to these clock genes, and we found little evidence of more widespread rare-variant convergence. The</w:t>
-      </w:r>
-      <w:r>
-        <w:t xml:space="preserve"> </w:t>
-      </w:r>
-      <w:r>
-        <w:rPr>
-          <w:iCs/>
-          <w:i/>
-        </w:rPr>
-        <w:t xml:space="preserve">MTNR1B</w:t>
-      </w:r>
-      <w:r>
-        <w:t xml:space="preserve"> </w:t>
-      </w:r>
-      <w:r>
-        <w:t xml:space="preserve">association with morningness depended on the masks up to 1% frequency, and the gene lies outside the chronotype loci. It may therefore partly reflect common variation near</w:t>
-      </w:r>
-      <w:r>
-        <w:t xml:space="preserve"> </w:t>
-      </w:r>
-      <w:r>
-        <w:rPr>
-          <w:iCs/>
-          <w:i/>
-        </w:rPr>
-        <w:t xml:space="preserve">MTNR1B</w:t>
-      </w:r>
-      <w:r>
-        <w:t xml:space="preserve">, which also has a common-variant gene-level signal.</w:t>
-      </w:r>
-    </w:p>
-    <w:p>
-      <w:pPr>
-        <w:pStyle w:val="BodyText"/>
-      </w:pPr>
-      <w:r>
-        <w:t xml:space="preserve">At</w:t>
-      </w:r>
-      <w:r>
-        <w:t xml:space="preserve"> </w:t>
-      </w:r>
-      <w:r>
-        <w:rPr>
-          <w:iCs/>
-          <w:i/>
-        </w:rPr>
-        <w:t xml:space="preserve">KCNH2</w:t>
-      </w:r>
-      <w:r>
-        <w:t xml:space="preserve">, our data suggest that a chronotype signal and a secondary QT-interval signal may share a causal variant, at which the allele associated with morningness would lengthen the QT interval. Cardiac repolarisation is under circadian control: the cardiomyocyte clock regulates</w:t>
-      </w:r>
-      <w:r>
-        <w:t xml:space="preserve"> </w:t>
-      </w:r>
-      <w:r>
-        <w:rPr>
-          <w:iCs/>
-          <w:i/>
-        </w:rPr>
-        <w:t xml:space="preserve">Kcnh2</w:t>
-      </w:r>
-      <w:r>
-        <w:t xml:space="preserve"> </w:t>
-      </w:r>
-      <w:r>
-        <w:t xml:space="preserve">expression and ventricular repolarisation</w:t>
-      </w:r>
-      <w:r>
-        <w:rPr>
-          <w:vertAlign w:val="superscript"/>
-        </w:rPr>
-        <w:t xml:space="preserve">48–50</w:t>
-      </w:r>
-      <w:r>
-        <w:t xml:space="preserve">, and cardiac events in long QT syndrome cluster by time of day in a genotype-dependent way</w:t>
-      </w:r>
-      <w:r>
-        <w:rPr>
-          <w:vertAlign w:val="superscript"/>
-        </w:rPr>
-        <w:t xml:space="preserve">97,98</w:t>
-      </w:r>
-      <w:r>
-        <w:t xml:space="preserve">. A variant that influences both circadian preference and the QT interval would therefore be of interest for chronomic medicine. The evidence is, however, limited. The conditional analysis was post hoc, and the chronotype association at this locus is not genome-wide significant in the UK Biobank data. The joint conditional model showed signs of mismatch between the 503-sample European reference panel and the multi-ancestry QT meta-analysis. The gene through which the variant acts is unknown:</w:t>
-      </w:r>
-      <w:r>
-        <w:t xml:space="preserve"> </w:t>
-      </w:r>
-      <w:r>
-        <w:rPr>
-          <w:iCs/>
-          <w:i/>
-        </w:rPr>
-        <w:t xml:space="preserve">KCNH2</w:t>
-      </w:r>
-      <w:r>
-        <w:t xml:space="preserve"> </w:t>
-      </w:r>
-      <w:r>
-        <w:t xml:space="preserve">has little other gene-level support for chronotype and is also expressed in the brain. The finding should be tested with in-sample LD (for example, conditional or SuSiE-based colocalisation in UK Biobank) and an independent chronotype GWAS. Complement and immune phenotypes, by contrast, were not enriched, despite strong evidence for circadian control of immunity</w:t>
-      </w:r>
-      <w:r>
-        <w:rPr>
-          <w:vertAlign w:val="superscript"/>
-        </w:rPr>
-        <w:t xml:space="preserve">51</w:t>
-      </w:r>
-      <w:r>
-        <w:t xml:space="preserve">.</w:t>
-      </w:r>
-    </w:p>
-    <w:p>
-      <w:pPr>
-        <w:pStyle w:val="BodyText"/>
-      </w:pPr>
-      <w:r>
-        <w:t xml:space="preserve">One practical observation concerns phenotype ontologies. HPO includes modifiers for temporal patterns, such as</w:t>
-      </w:r>
-      <w:r>
-        <w:t xml:space="preserve"> </w:t>
-      </w:r>
-      <w:r>
-        <w:t xml:space="preserve">“</w:t>
-      </w:r>
-      <w:r>
-        <w:t xml:space="preserve">Diurnal</w:t>
-      </w:r>
-      <w:r>
-        <w:t xml:space="preserve">”</w:t>
-      </w:r>
-      <w:r>
-        <w:t xml:space="preserve"> </w:t>
-      </w:r>
-      <w:r>
-        <w:t xml:space="preserve">(HP:0025302),</w:t>
-      </w:r>
-      <w:r>
-        <w:t xml:space="preserve"> </w:t>
-      </w:r>
-      <w:r>
-        <w:t xml:space="preserve">“</w:t>
-      </w:r>
-      <w:r>
-        <w:t xml:space="preserve">Fluctuating</w:t>
-      </w:r>
-      <w:r>
-        <w:t xml:space="preserve">”</w:t>
-      </w:r>
-      <w:r>
-        <w:t xml:space="preserve"> </w:t>
-      </w:r>
-      <w:r>
-        <w:t xml:space="preserve">(HP:0031914),</w:t>
-      </w:r>
-      <w:r>
-        <w:t xml:space="preserve"> </w:t>
-      </w:r>
-      <w:r>
-        <w:t xml:space="preserve">“</w:t>
-      </w:r>
-      <w:r>
-        <w:t xml:space="preserve">Nocturnal</w:t>
-      </w:r>
-      <w:r>
-        <w:t xml:space="preserve">”</w:t>
-      </w:r>
-      <w:r>
-        <w:t xml:space="preserve"> </w:t>
-      </w:r>
-      <w:r>
-        <w:t xml:space="preserve">(HP:0025301) and</w:t>
-      </w:r>
-      <w:r>
-        <w:t xml:space="preserve"> </w:t>
-      </w:r>
-      <w:r>
-        <w:t xml:space="preserve">“</w:t>
-      </w:r>
-      <w:r>
-        <w:t xml:space="preserve">Worse in evening</w:t>
-      </w:r>
-      <w:r>
-        <w:t xml:space="preserve">”</w:t>
-      </w:r>
-      <w:r>
-        <w:t xml:space="preserve"> </w:t>
-      </w:r>
-      <w:r>
-        <w:t xml:space="preserve">(HP:0410401). In the release we used, the diurnal, fluctuating and worse-in-evening modifiers together accounted for 0 of the 286,651 disease–phenotype annotations, and the nocturnal modifier for 1. The 134 annotations with any temporal-pattern modifier mostly described recurrence or chronicity. Dopa-responsive dystonia, a textbook example of a disease with diurnal fluctuation, is not annotated as such. Apart from a few phenotype terms that build in timing, such as nocturnal seizures, time-of-day features of rare diseases are therefore largely absent from the annotations that computational analyses such as ours depend on. Systematic chronomic phenotyping, meaning annotation of when symptoms, events and biomarker abnormalities occur, would be a straightforward step towards chronomic medicine.</w:t>
-      </w:r>
-    </w:p>
-    <w:p>
-      <w:pPr>
-        <w:pStyle w:val="BodyText"/>
-      </w:pPr>
-      <w:r>
-        <w:t xml:space="preserve">This study has limitations. All chronotype data were from individuals of European ancestry, and chronotype was self-reported. The MAGMA, burden and colocalisation analyses used UK Biobank data alone, because the 23andMe statistics are not public, and the LD reference contained only 503 individuals. Gene-to-disease and phenotype annotations are incomplete and biased towards well-studied syndromes. Matching on gene count approximates, but does not eliminate, differences between chronotype and null loci. GWAS signals tend to lie near LoF-constrained, dosage-sensitive genes, which are over-represented among genes for dominant and neurodevelopmental disorders</w:t>
-      </w:r>
-      <w:r>
-        <w:rPr>
-          <w:vertAlign w:val="superscript"/>
-        </w:rPr>
         <w:t xml:space="preserve">83,99</w:t>
       </w:r>
       <w:r>
-        <w:t xml:space="preserve">, so some of the locus-level enrichments may partly reflect this general property; the sleep-disturbance excess, however, persisted among loci containing dominant or neurodevelopmental disease genes. We did not adjust for constraint, because it may itself lie on the causal path from gene to phenotype, in which case adjustment would remove true signal. The analysis plan was not pre-registered, and several analyses were added post hoc. The ACAT combination of burden tests is approximate and discards direction, and the four chronotype categories are not independent. The Open Targets colocalisations were derived from fine-mapping posteriors rather than full coloc. The</w:t>
+        <w:t xml:space="preserve">, so some of the locus-level enrichments, including that of sleep-disturbance genes, may partly reflect this general property. We did not adjust for constraint, because it may itself lie on the causal path from gene to phenotype, in which case adjustment would remove true signal. The analysis plan was not pre-registered, and several analyses were added post hoc. The ACAT combination of burden tests is approximate and discards direction, and the four chronotype categories are not independent. The Open Targets colocalisations were derived from fine-mapping posteriors rather than full coloc. The</w:t>
       </w:r>
       <w:r>
         <w:t xml:space="preserve"> </w:t>
@@ -8080,7 +8071,7 @@
         <w:t xml:space="preserve"> </w:t>
       </w:r>
       <w:r>
-        <w:t xml:space="preserve">(A) Fold enrichment (observed/expected loci) for Mendelian, control, pre-specified, post hoc and rhythmic-expression gene sets, against null loci matched for allele frequency, LD partners, gene count and distance. Filled circles: FDR q &lt; 0.05 within set family; grey diamonds: post hoc sets, for which q is not computed. Columns give observed/expected loci, the exact locus-level p-value and the gene-level MAGMA p-value (marginal model). (B) HPO organ systems with ≥ 5 expected loci, shown in the same way. Several organ systems are enriched within loci, but none has gene-level support.</w:t>
+        <w:t xml:space="preserve">(A) Fold enrichment (observed/expected loci) for Mendelian, control, pre-specified, post hoc and rhythmic-expression gene sets, against null loci matched for allele frequency, LD partners, gene count and distance. Filled circles: FDR q &lt; 0.05 within set family; grey diamonds: post hoc sets, for which q is not shown. Columns give observed/expected loci, the exact locus-level p-value and the gene-level MAGMA p-value (marginal model). (B) HPO organ systems with ≥ 5 expected loci, shown in the same way. Several organ systems are enriched within loci, but none has gene-level support.</w:t>
       </w:r>
     </w:p>
     <w:p>

</xml_diff>

<commit_message>
Fit every figure within a 174 mm two-column width
Figures 4 and 5 were 203 mm wide because text ran past the canvas, wider
than any journal's two-column maximum.
- Figure 4: the axes fill the canvas at the same drawing scale, and the two
  legend blocks wrap onto shorter lines (151 mm).
- Figure 5: both panels move inwards, the panel letters sit on the canvas,
  the row labels are 6.4 pt and the panel B legend is pulled left (172 mm).
- All figures: margin around the content trimmed from 0.1 to 0.04 inch.
Content is unchanged. The Word file is rebuilt with the new figures.

Co-Authored-By: Claude Opus 5.5 <noreply@anthropic.com>
Claude-Session: https://claude.ai/code/session_01PWS6UKnuANnJCeVsVNAkng
</commit_message>
<xml_diff>
--- a/manuscript/Malik_Hearn_Towards_chronomic_medicine_2026.docx
+++ b/manuscript/Malik_Hearn_Towards_chronomic_medicine_2026.docx
@@ -9010,7 +9010,7 @@
       <w:r>
         <w:drawing>
           <wp:inline>
-            <wp:extent cx="5727700" cy="3554212"/>
+            <wp:extent cx="5727700" cy="3508131"/>
             <wp:effectExtent b="0" l="0" r="0" t="0"/>
             <wp:docPr descr="" title="" id="48" name="Picture"/>
             <a:graphic>
@@ -9031,7 +9031,7 @@
                   <pic:spPr bwMode="auto">
                     <a:xfrm>
                       <a:off x="0" y="0"/>
-                      <a:ext cx="5727700" cy="3554212"/>
+                      <a:ext cx="5727700" cy="3508131"/>
                     </a:xfrm>
                     <a:prstGeom prst="rect">
                       <a:avLst/>
@@ -9093,7 +9093,7 @@
       <w:r>
         <w:drawing>
           <wp:inline>
-            <wp:extent cx="3969355" cy="6309360"/>
+            <wp:extent cx="3941526" cy="6309360"/>
             <wp:effectExtent b="0" l="0" r="0" t="0"/>
             <wp:docPr descr="" title="" id="51" name="Picture"/>
             <a:graphic>
@@ -9114,7 +9114,7 @@
                   <pic:spPr bwMode="auto">
                     <a:xfrm>
                       <a:off x="0" y="0"/>
-                      <a:ext cx="3969355" cy="6309360"/>
+                      <a:ext cx="3941526" cy="6309360"/>
                     </a:xfrm>
                     <a:prstGeom prst="rect">
                       <a:avLst/>
@@ -9163,7 +9163,7 @@
       <w:r>
         <w:drawing>
           <wp:inline>
-            <wp:extent cx="4701372" cy="6675120"/>
+            <wp:extent cx="4675056" cy="6675120"/>
             <wp:effectExtent b="0" l="0" r="0" t="0"/>
             <wp:docPr descr="" title="" id="54" name="Picture"/>
             <a:graphic>
@@ -9184,7 +9184,7 @@
                   <pic:spPr bwMode="auto">
                     <a:xfrm>
                       <a:off x="0" y="0"/>
-                      <a:ext cx="4701372" cy="6675120"/>
+                      <a:ext cx="4675056" cy="6675120"/>
                     </a:xfrm>
                     <a:prstGeom prst="rect">
                       <a:avLst/>
@@ -9233,7 +9233,7 @@
       <w:r>
         <w:drawing>
           <wp:inline>
-            <wp:extent cx="5727700" cy="2130847"/>
+            <wp:extent cx="5727700" cy="2916973"/>
             <wp:effectExtent b="0" l="0" r="0" t="0"/>
             <wp:docPr descr="" title="" id="57" name="Picture"/>
             <a:graphic>
@@ -9254,7 +9254,7 @@
                   <pic:spPr bwMode="auto">
                     <a:xfrm>
                       <a:off x="0" y="0"/>
-                      <a:ext cx="5727700" cy="2130847"/>
+                      <a:ext cx="5727700" cy="2916973"/>
                     </a:xfrm>
                     <a:prstGeom prst="rect">
                       <a:avLst/>
@@ -9367,7 +9367,7 @@
       <w:r>
         <w:drawing>
           <wp:inline>
-            <wp:extent cx="5727700" cy="2909232"/>
+            <wp:extent cx="5727700" cy="3201855"/>
             <wp:effectExtent b="0" l="0" r="0" t="0"/>
             <wp:docPr descr="" title="" id="60" name="Picture"/>
             <a:graphic>
@@ -9388,7 +9388,7 @@
                   <pic:spPr bwMode="auto">
                     <a:xfrm>
                       <a:off x="0" y="0"/>
-                      <a:ext cx="5727700" cy="2909232"/>
+                      <a:ext cx="5727700" cy="3201855"/>
                     </a:xfrm>
                     <a:prstGeom prst="rect">
                       <a:avLst/>
@@ -9449,7 +9449,7 @@
       <w:r>
         <w:drawing>
           <wp:inline>
-            <wp:extent cx="5727700" cy="4016270"/>
+            <wp:extent cx="5727700" cy="3984867"/>
             <wp:effectExtent b="0" l="0" r="0" t="0"/>
             <wp:docPr descr="" title="" id="63" name="Picture"/>
             <a:graphic>
@@ -9470,7 +9470,7 @@
                   <pic:spPr bwMode="auto">
                     <a:xfrm>
                       <a:off x="0" y="0"/>
-                      <a:ext cx="5727700" cy="4016270"/>
+                      <a:ext cx="5727700" cy="3984867"/>
                     </a:xfrm>
                     <a:prstGeom prst="rect">
                       <a:avLst/>

</xml_diff>